<commit_message>
Added .gitignore and topic 5 tasks
</commit_message>
<xml_diff>
--- a/TopicSummary.docx
+++ b/TopicSummary.docx
@@ -306,12 +306,12 @@
           <wp:inline distB="114300" distT="114300" distL="114300" distR="114300">
             <wp:extent cx="5876925" cy="542925"/>
             <wp:effectExtent b="0" l="0" r="0" t="0"/>
-            <wp:docPr id="4" name="image3.png"/>
+            <wp:docPr id="6" name="image7.png"/>
             <a:graphic>
               <a:graphicData uri="http://schemas.openxmlformats.org/drawingml/2006/picture">
                 <pic:pic>
                   <pic:nvPicPr>
-                    <pic:cNvPr id="0" name="image3.png"/>
+                    <pic:cNvPr id="0" name="image7.png"/>
                     <pic:cNvPicPr preferRelativeResize="0"/>
                   </pic:nvPicPr>
                   <pic:blipFill>
@@ -417,12 +417,12 @@
           <wp:inline distB="114300" distT="114300" distL="114300" distR="114300">
             <wp:extent cx="1885950" cy="1447800"/>
             <wp:effectExtent b="0" l="0" r="0" t="0"/>
-            <wp:docPr id="5" name="image6.png"/>
+            <wp:docPr id="7" name="image4.png"/>
             <a:graphic>
               <a:graphicData uri="http://schemas.openxmlformats.org/drawingml/2006/picture">
                 <pic:pic>
                   <pic:nvPicPr>
-                    <pic:cNvPr id="0" name="image6.png"/>
+                    <pic:cNvPr id="0" name="image4.png"/>
                     <pic:cNvPicPr preferRelativeResize="0"/>
                   </pic:nvPicPr>
                   <pic:blipFill>
@@ -508,12 +508,12 @@
           <wp:inline distB="114300" distT="114300" distL="114300" distR="114300">
             <wp:extent cx="5867400" cy="1343025"/>
             <wp:effectExtent b="0" l="0" r="0" t="0"/>
-            <wp:docPr id="1" name="image2.png"/>
+            <wp:docPr id="2" name="image5.png"/>
             <a:graphic>
               <a:graphicData uri="http://schemas.openxmlformats.org/drawingml/2006/picture">
                 <pic:pic>
                   <pic:nvPicPr>
-                    <pic:cNvPr id="0" name="image2.png"/>
+                    <pic:cNvPr id="0" name="image5.png"/>
                     <pic:cNvPicPr preferRelativeResize="0"/>
                   </pic:nvPicPr>
                   <pic:blipFill>
@@ -619,12 +619,12 @@
           <wp:inline distB="114300" distT="114300" distL="114300" distR="114300">
             <wp:extent cx="5857875" cy="2428875"/>
             <wp:effectExtent b="0" l="0" r="0" t="0"/>
-            <wp:docPr id="8" name="image4.png"/>
+            <wp:docPr id="11" name="image9.png"/>
             <a:graphic>
               <a:graphicData uri="http://schemas.openxmlformats.org/drawingml/2006/picture">
                 <pic:pic>
                   <pic:nvPicPr>
-                    <pic:cNvPr id="0" name="image4.png"/>
+                    <pic:cNvPr id="0" name="image9.png"/>
                     <pic:cNvPicPr preferRelativeResize="0"/>
                   </pic:nvPicPr>
                   <pic:blipFill>
@@ -870,12 +870,12 @@
           <wp:inline distB="114300" distT="114300" distL="114300" distR="114300">
             <wp:extent cx="5895975" cy="1619250"/>
             <wp:effectExtent b="0" l="0" r="0" t="0"/>
-            <wp:docPr id="7" name="image7.png"/>
+            <wp:docPr id="9" name="image8.png"/>
             <a:graphic>
               <a:graphicData uri="http://schemas.openxmlformats.org/drawingml/2006/picture">
                 <pic:pic>
                   <pic:nvPicPr>
-                    <pic:cNvPr id="0" name="image7.png"/>
+                    <pic:cNvPr id="0" name="image8.png"/>
                     <pic:cNvPicPr preferRelativeResize="0"/>
                   </pic:nvPicPr>
                   <pic:blipFill>
@@ -997,12 +997,12 @@
           <wp:inline distB="114300" distT="114300" distL="114300" distR="114300">
             <wp:extent cx="5886450" cy="2447925"/>
             <wp:effectExtent b="0" l="0" r="0" t="0"/>
-            <wp:docPr id="10" name="image10.png"/>
+            <wp:docPr id="13" name="image15.png"/>
             <a:graphic>
               <a:graphicData uri="http://schemas.openxmlformats.org/drawingml/2006/picture">
                 <pic:pic>
                   <pic:nvPicPr>
-                    <pic:cNvPr id="0" name="image10.png"/>
+                    <pic:cNvPr id="0" name="image15.png"/>
                     <pic:cNvPicPr preferRelativeResize="0"/>
                   </pic:nvPicPr>
                   <pic:blipFill>
@@ -1108,12 +1108,12 @@
           <wp:inline distB="114300" distT="114300" distL="114300" distR="114300">
             <wp:extent cx="5876925" cy="2447925"/>
             <wp:effectExtent b="0" l="0" r="0" t="0"/>
-            <wp:docPr id="3" name="image1.png"/>
+            <wp:docPr id="5" name="image11.png"/>
             <a:graphic>
               <a:graphicData uri="http://schemas.openxmlformats.org/drawingml/2006/picture">
                 <pic:pic>
                   <pic:nvPicPr>
-                    <pic:cNvPr id="0" name="image1.png"/>
+                    <pic:cNvPr id="0" name="image11.png"/>
                     <pic:cNvPicPr preferRelativeResize="0"/>
                   </pic:nvPicPr>
                   <pic:blipFill>
@@ -1370,12 +1370,12 @@
           <wp:inline distB="114300" distT="114300" distL="114300" distR="114300">
             <wp:extent cx="5943600" cy="1790700"/>
             <wp:effectExtent b="0" l="0" r="0" t="0"/>
-            <wp:docPr id="2" name="image11.png"/>
+            <wp:docPr id="4" name="image13.png"/>
             <a:graphic>
               <a:graphicData uri="http://schemas.openxmlformats.org/drawingml/2006/picture">
                 <pic:pic>
                   <pic:nvPicPr>
-                    <pic:cNvPr id="0" name="image11.png"/>
+                    <pic:cNvPr id="0" name="image13.png"/>
                     <pic:cNvPicPr preferRelativeResize="0"/>
                   </pic:nvPicPr>
                   <pic:blipFill>
@@ -1477,12 +1477,12 @@
           <wp:inline distB="114300" distT="114300" distL="114300" distR="114300">
             <wp:extent cx="5943600" cy="1625600"/>
             <wp:effectExtent b="0" l="0" r="0" t="0"/>
-            <wp:docPr id="11" name="image8.png"/>
+            <wp:docPr id="14" name="image14.png"/>
             <a:graphic>
               <a:graphicData uri="http://schemas.openxmlformats.org/drawingml/2006/picture">
                 <pic:pic>
                   <pic:nvPicPr>
-                    <pic:cNvPr id="0" name="image8.png"/>
+                    <pic:cNvPr id="0" name="image14.png"/>
                     <pic:cNvPicPr preferRelativeResize="0"/>
                   </pic:nvPicPr>
                   <pic:blipFill>
@@ -1584,12 +1584,12 @@
           <wp:inline distB="114300" distT="114300" distL="114300" distR="114300">
             <wp:extent cx="5943600" cy="1320800"/>
             <wp:effectExtent b="0" l="0" r="0" t="0"/>
-            <wp:docPr id="6" name="image9.png"/>
+            <wp:docPr id="8" name="image12.png"/>
             <a:graphic>
               <a:graphicData uri="http://schemas.openxmlformats.org/drawingml/2006/picture">
                 <pic:pic>
                   <pic:nvPicPr>
-                    <pic:cNvPr id="0" name="image9.png"/>
+                    <pic:cNvPr id="0" name="image12.png"/>
                     <pic:cNvPicPr preferRelativeResize="0"/>
                   </pic:nvPicPr>
                   <pic:blipFill>
@@ -1691,12 +1691,12 @@
           <wp:inline distB="114300" distT="114300" distL="114300" distR="114300">
             <wp:extent cx="5943600" cy="850900"/>
             <wp:effectExtent b="0" l="0" r="0" t="0"/>
-            <wp:docPr id="12" name="image12.png"/>
+            <wp:docPr id="16" name="image16.png"/>
             <a:graphic>
               <a:graphicData uri="http://schemas.openxmlformats.org/drawingml/2006/picture">
                 <pic:pic>
                   <pic:nvPicPr>
-                    <pic:cNvPr id="0" name="image12.png"/>
+                    <pic:cNvPr id="0" name="image16.png"/>
                     <pic:cNvPicPr preferRelativeResize="0"/>
                   </pic:nvPicPr>
                   <pic:blipFill>
@@ -1874,12 +1874,12 @@
           <wp:inline distB="114300" distT="114300" distL="114300" distR="114300">
             <wp:extent cx="5791200" cy="3381375"/>
             <wp:effectExtent b="0" l="0" r="0" t="0"/>
-            <wp:docPr id="9" name="image5.png"/>
+            <wp:docPr id="12" name="image10.png"/>
             <a:graphic>
               <a:graphicData uri="http://schemas.openxmlformats.org/drawingml/2006/picture">
                 <pic:pic>
                   <pic:nvPicPr>
-                    <pic:cNvPr id="0" name="image5.png"/>
+                    <pic:cNvPr id="0" name="image10.png"/>
                     <pic:cNvPicPr preferRelativeResize="0"/>
                   </pic:nvPicPr>
                   <pic:blipFill>
@@ -1947,18 +1947,439 @@
             <w:u w:val="single"/>
             <w:rtl w:val="0"/>
           </w:rPr>
-          <w:t xml:space="preserve">https://github.com/dima648228/ProgrammingTechnologiesCS252-Vyshniak/tree/main/topic_0</w:t>
+          <w:t xml:space="preserve">https://github.com/dima648228/ProgrammingTechnologiesCS252-Vyshniak/tree/main/topic_04</w:t>
         </w:r>
       </w:hyperlink>
       <w:r>
         <w:rPr>
-          <w:rFonts w:ascii="Times New Roman" w:cs="Times New Roman" w:eastAsia="Times New Roman" w:hAnsi="Times New Roman"/>
-          <w:sz w:val="28"/>
-          <w:szCs w:val="28"/>
-          <w:rtl w:val="0"/>
-        </w:rPr>
-        <w:t xml:space="preserve">4</w:t>
-      </w:r>
+          <w:rtl w:val="0"/>
+        </w:rPr>
+      </w:r>
+    </w:p>
+    <w:p>
+      <w:pPr>
+        <w:jc w:val="both"/>
+        <w:rPr>
+          <w:rFonts w:ascii="Times New Roman" w:cs="Times New Roman" w:eastAsia="Times New Roman" w:hAnsi="Times New Roman"/>
+          <w:sz w:val="28"/>
+          <w:szCs w:val="28"/>
+        </w:rPr>
+      </w:pPr>
+      <w:r>
+        <w:rPr>
+          <w:rtl w:val="0"/>
+        </w:rPr>
+      </w:r>
+    </w:p>
+    <w:p>
+      <w:pPr>
+        <w:jc w:val="center"/>
+        <w:rPr>
+          <w:rFonts w:ascii="Times New Roman" w:cs="Times New Roman" w:eastAsia="Times New Roman" w:hAnsi="Times New Roman"/>
+          <w:b w:val="1"/>
+          <w:bCs w:val="1"/>
+          <w:sz w:val="28"/>
+          <w:szCs w:val="28"/>
+        </w:rPr>
+      </w:pPr>
+      <w:r>
+        <w:rPr>
+          <w:rFonts w:ascii="Times New Roman" w:cs="Times New Roman" w:eastAsia="Times New Roman" w:hAnsi="Times New Roman"/>
+          <w:b w:val="1"/>
+          <w:bCs w:val="1"/>
+          <w:sz w:val="28"/>
+          <w:szCs w:val="28"/>
+          <w:rtl w:val="0"/>
+        </w:rPr>
+        <w:t xml:space="preserve">Тема №5: Бібліотеки</w:t>
+      </w:r>
+    </w:p>
+    <w:p>
+      <w:pPr>
+        <w:jc w:val="both"/>
+        <w:rPr>
+          <w:rFonts w:ascii="Times New Roman" w:cs="Times New Roman" w:eastAsia="Times New Roman" w:hAnsi="Times New Roman"/>
+          <w:sz w:val="28"/>
+          <w:szCs w:val="28"/>
+        </w:rPr>
+      </w:pPr>
+      <w:r>
+        <w:rPr>
+          <w:rFonts w:ascii="Times New Roman" w:cs="Times New Roman" w:eastAsia="Times New Roman" w:hAnsi="Times New Roman"/>
+          <w:sz w:val="28"/>
+          <w:szCs w:val="28"/>
+          <w:rtl w:val="0"/>
+        </w:rPr>
+        <w:t xml:space="preserve">Завдання 1:</w:t>
+      </w:r>
+    </w:p>
+    <w:p>
+      <w:pPr>
+        <w:jc w:val="both"/>
+        <w:rPr>
+          <w:rFonts w:ascii="Times New Roman" w:cs="Times New Roman" w:eastAsia="Times New Roman" w:hAnsi="Times New Roman"/>
+          <w:sz w:val="28"/>
+          <w:szCs w:val="28"/>
+        </w:rPr>
+      </w:pPr>
+      <w:r>
+        <w:rPr>
+          <w:rFonts w:ascii="Times New Roman" w:cs="Times New Roman" w:eastAsia="Times New Roman" w:hAnsi="Times New Roman"/>
+          <w:sz w:val="28"/>
+          <w:szCs w:val="28"/>
+          <w:rtl w:val="0"/>
+        </w:rPr>
+        <w:t xml:space="preserve">Реалізовано гру камінь, ножиці, папір. Результат:</w:t>
+      </w:r>
+      <w:r>
+        <w:rPr>
+          <w:rFonts w:ascii="Times New Roman" w:cs="Times New Roman" w:eastAsia="Times New Roman" w:hAnsi="Times New Roman"/>
+          <w:sz w:val="28"/>
+          <w:szCs w:val="28"/>
+        </w:rPr>
+        <w:drawing>
+          <wp:inline distB="114300" distT="114300" distL="114300" distR="114300">
+            <wp:extent cx="5943600" cy="2476500"/>
+            <wp:effectExtent b="0" l="0" r="0" t="0"/>
+            <wp:docPr id="3" name="image3.png"/>
+            <a:graphic>
+              <a:graphicData uri="http://schemas.openxmlformats.org/drawingml/2006/picture">
+                <pic:pic>
+                  <pic:nvPicPr>
+                    <pic:cNvPr id="0" name="image3.png"/>
+                    <pic:cNvPicPr preferRelativeResize="0"/>
+                  </pic:nvPicPr>
+                  <pic:blipFill>
+                    <a:blip r:embed="rId23"/>
+                    <a:srcRect b="0" l="0" r="0" t="0"/>
+                    <a:stretch>
+                      <a:fillRect/>
+                    </a:stretch>
+                  </pic:blipFill>
+                  <pic:spPr>
+                    <a:xfrm>
+                      <a:off x="0" y="0"/>
+                      <a:ext cx="5943600" cy="2476500"/>
+                    </a:xfrm>
+                    <a:prstGeom prst="rect"/>
+                    <a:ln/>
+                  </pic:spPr>
+                </pic:pic>
+              </a:graphicData>
+            </a:graphic>
+          </wp:inline>
+        </w:drawing>
+      </w:r>
+      <w:r>
+        <w:rPr>
+          <w:rtl w:val="0"/>
+        </w:rPr>
+      </w:r>
+    </w:p>
+    <w:p>
+      <w:pPr>
+        <w:jc w:val="both"/>
+        <w:rPr>
+          <w:rFonts w:ascii="Times New Roman" w:cs="Times New Roman" w:eastAsia="Times New Roman" w:hAnsi="Times New Roman"/>
+          <w:sz w:val="28"/>
+          <w:szCs w:val="28"/>
+        </w:rPr>
+      </w:pPr>
+      <w:r>
+        <w:rPr>
+          <w:rtl w:val="0"/>
+        </w:rPr>
+      </w:r>
+    </w:p>
+    <w:p>
+      <w:pPr>
+        <w:jc w:val="both"/>
+        <w:rPr>
+          <w:rFonts w:ascii="Times New Roman" w:cs="Times New Roman" w:eastAsia="Times New Roman" w:hAnsi="Times New Roman"/>
+          <w:sz w:val="28"/>
+          <w:szCs w:val="28"/>
+        </w:rPr>
+      </w:pPr>
+      <w:r>
+        <w:rPr>
+          <w:rFonts w:ascii="Times New Roman" w:cs="Times New Roman" w:eastAsia="Times New Roman" w:hAnsi="Times New Roman"/>
+          <w:sz w:val="28"/>
+          <w:szCs w:val="28"/>
+          <w:rtl w:val="0"/>
+        </w:rPr>
+        <w:t xml:space="preserve">Завдання 2:</w:t>
+      </w:r>
+    </w:p>
+    <w:p>
+      <w:pPr>
+        <w:jc w:val="both"/>
+        <w:rPr>
+          <w:rFonts w:ascii="Times New Roman" w:cs="Times New Roman" w:eastAsia="Times New Roman" w:hAnsi="Times New Roman"/>
+          <w:sz w:val="28"/>
+          <w:szCs w:val="28"/>
+        </w:rPr>
+      </w:pPr>
+      <w:r>
+        <w:rPr>
+          <w:rFonts w:ascii="Times New Roman" w:cs="Times New Roman" w:eastAsia="Times New Roman" w:hAnsi="Times New Roman"/>
+          <w:sz w:val="28"/>
+          <w:szCs w:val="28"/>
+          <w:rtl w:val="0"/>
+        </w:rPr>
+        <w:t xml:space="preserve">Реалізовано програму для конвертації валют, яка вміє працювати з валютами USD, EUR та PLN. Результат:</w:t>
+        <w:br w:type="textWrapping"/>
+      </w:r>
+      <w:r>
+        <w:rPr>
+          <w:rFonts w:ascii="Times New Roman" w:cs="Times New Roman" w:eastAsia="Times New Roman" w:hAnsi="Times New Roman"/>
+          <w:sz w:val="28"/>
+          <w:szCs w:val="28"/>
+        </w:rPr>
+        <w:drawing>
+          <wp:inline distB="114300" distT="114300" distL="114300" distR="114300">
+            <wp:extent cx="5943600" cy="2501900"/>
+            <wp:effectExtent b="0" l="0" r="0" t="0"/>
+            <wp:docPr id="10" name="image2.png"/>
+            <a:graphic>
+              <a:graphicData uri="http://schemas.openxmlformats.org/drawingml/2006/picture">
+                <pic:pic>
+                  <pic:nvPicPr>
+                    <pic:cNvPr id="0" name="image2.png"/>
+                    <pic:cNvPicPr preferRelativeResize="0"/>
+                  </pic:nvPicPr>
+                  <pic:blipFill>
+                    <a:blip r:embed="rId24"/>
+                    <a:srcRect b="0" l="0" r="0" t="0"/>
+                    <a:stretch>
+                      <a:fillRect/>
+                    </a:stretch>
+                  </pic:blipFill>
+                  <pic:spPr>
+                    <a:xfrm>
+                      <a:off x="0" y="0"/>
+                      <a:ext cx="5943600" cy="2501900"/>
+                    </a:xfrm>
+                    <a:prstGeom prst="rect"/>
+                    <a:ln/>
+                  </pic:spPr>
+                </pic:pic>
+              </a:graphicData>
+            </a:graphic>
+          </wp:inline>
+        </w:drawing>
+      </w:r>
+      <w:r>
+        <w:rPr>
+          <w:rtl w:val="0"/>
+        </w:rPr>
+      </w:r>
+    </w:p>
+    <w:p>
+      <w:pPr>
+        <w:jc w:val="both"/>
+        <w:rPr>
+          <w:rFonts w:ascii="Times New Roman" w:cs="Times New Roman" w:eastAsia="Times New Roman" w:hAnsi="Times New Roman"/>
+          <w:sz w:val="28"/>
+          <w:szCs w:val="28"/>
+        </w:rPr>
+      </w:pPr>
+      <w:r>
+        <w:rPr>
+          <w:rtl w:val="0"/>
+        </w:rPr>
+      </w:r>
+    </w:p>
+    <w:p>
+      <w:pPr>
+        <w:jc w:val="both"/>
+        <w:rPr>
+          <w:rFonts w:ascii="Times New Roman" w:cs="Times New Roman" w:eastAsia="Times New Roman" w:hAnsi="Times New Roman"/>
+          <w:sz w:val="28"/>
+          <w:szCs w:val="28"/>
+        </w:rPr>
+      </w:pPr>
+      <w:r>
+        <w:rPr>
+          <w:rFonts w:ascii="Times New Roman" w:cs="Times New Roman" w:eastAsia="Times New Roman" w:hAnsi="Times New Roman"/>
+          <w:sz w:val="28"/>
+          <w:szCs w:val="28"/>
+          <w:rtl w:val="0"/>
+        </w:rPr>
+        <w:t xml:space="preserve">Завдання 3:</w:t>
+        <w:br w:type="textWrapping"/>
+        <w:t xml:space="preserve">Функції калькулятора було винесено у окремі файли functions та operations. Результат:</w:t>
+      </w:r>
+    </w:p>
+    <w:p>
+      <w:pPr>
+        <w:jc w:val="both"/>
+        <w:rPr>
+          <w:rFonts w:ascii="Times New Roman" w:cs="Times New Roman" w:eastAsia="Times New Roman" w:hAnsi="Times New Roman"/>
+          <w:sz w:val="28"/>
+          <w:szCs w:val="28"/>
+        </w:rPr>
+      </w:pPr>
+      <w:r>
+        <w:rPr>
+          <w:rFonts w:ascii="Times New Roman" w:cs="Times New Roman" w:eastAsia="Times New Roman" w:hAnsi="Times New Roman"/>
+          <w:sz w:val="28"/>
+          <w:szCs w:val="28"/>
+        </w:rPr>
+        <w:drawing>
+          <wp:inline distB="114300" distT="114300" distL="114300" distR="114300">
+            <wp:extent cx="2838450" cy="1057275"/>
+            <wp:effectExtent b="0" l="0" r="0" t="0"/>
+            <wp:docPr id="1" name="image1.png"/>
+            <a:graphic>
+              <a:graphicData uri="http://schemas.openxmlformats.org/drawingml/2006/picture">
+                <pic:pic>
+                  <pic:nvPicPr>
+                    <pic:cNvPr id="0" name="image1.png"/>
+                    <pic:cNvPicPr preferRelativeResize="0"/>
+                  </pic:nvPicPr>
+                  <pic:blipFill>
+                    <a:blip r:embed="rId25"/>
+                    <a:srcRect b="0" l="0" r="0" t="0"/>
+                    <a:stretch>
+                      <a:fillRect/>
+                    </a:stretch>
+                  </pic:blipFill>
+                  <pic:spPr>
+                    <a:xfrm>
+                      <a:off x="0" y="0"/>
+                      <a:ext cx="2838450" cy="1057275"/>
+                    </a:xfrm>
+                    <a:prstGeom prst="rect"/>
+                    <a:ln/>
+                  </pic:spPr>
+                </pic:pic>
+              </a:graphicData>
+            </a:graphic>
+          </wp:inline>
+        </w:drawing>
+      </w:r>
+      <w:r>
+        <w:rPr>
+          <w:rtl w:val="0"/>
+        </w:rPr>
+      </w:r>
+    </w:p>
+    <w:p>
+      <w:pPr>
+        <w:jc w:val="both"/>
+        <w:rPr>
+          <w:rFonts w:ascii="Times New Roman" w:cs="Times New Roman" w:eastAsia="Times New Roman" w:hAnsi="Times New Roman"/>
+          <w:sz w:val="28"/>
+          <w:szCs w:val="28"/>
+        </w:rPr>
+      </w:pPr>
+      <w:r>
+        <w:rPr>
+          <w:rFonts w:ascii="Times New Roman" w:cs="Times New Roman" w:eastAsia="Times New Roman" w:hAnsi="Times New Roman"/>
+          <w:sz w:val="28"/>
+          <w:szCs w:val="28"/>
+        </w:rPr>
+        <w:drawing>
+          <wp:inline distB="114300" distT="114300" distL="114300" distR="114300">
+            <wp:extent cx="5943600" cy="1600200"/>
+            <wp:effectExtent b="0" l="0" r="0" t="0"/>
+            <wp:docPr id="15" name="image6.png"/>
+            <a:graphic>
+              <a:graphicData uri="http://schemas.openxmlformats.org/drawingml/2006/picture">
+                <pic:pic>
+                  <pic:nvPicPr>
+                    <pic:cNvPr id="0" name="image6.png"/>
+                    <pic:cNvPicPr preferRelativeResize="0"/>
+                  </pic:nvPicPr>
+                  <pic:blipFill>
+                    <a:blip r:embed="rId26"/>
+                    <a:srcRect b="0" l="0" r="0" t="0"/>
+                    <a:stretch>
+                      <a:fillRect/>
+                    </a:stretch>
+                  </pic:blipFill>
+                  <pic:spPr>
+                    <a:xfrm>
+                      <a:off x="0" y="0"/>
+                      <a:ext cx="5943600" cy="1600200"/>
+                    </a:xfrm>
+                    <a:prstGeom prst="rect"/>
+                    <a:ln/>
+                  </pic:spPr>
+                </pic:pic>
+              </a:graphicData>
+            </a:graphic>
+          </wp:inline>
+        </w:drawing>
+      </w:r>
+      <w:r>
+        <w:rPr>
+          <w:rtl w:val="0"/>
+        </w:rPr>
+      </w:r>
+    </w:p>
+    <w:p>
+      <w:pPr>
+        <w:jc w:val="both"/>
+        <w:rPr>
+          <w:rFonts w:ascii="Times New Roman" w:cs="Times New Roman" w:eastAsia="Times New Roman" w:hAnsi="Times New Roman"/>
+          <w:sz w:val="28"/>
+          <w:szCs w:val="28"/>
+        </w:rPr>
+      </w:pPr>
+      <w:r>
+        <w:rPr>
+          <w:rtl w:val="0"/>
+        </w:rPr>
+      </w:r>
+    </w:p>
+    <w:p>
+      <w:pPr>
+        <w:jc w:val="both"/>
+        <w:rPr>
+          <w:rFonts w:ascii="Times New Roman" w:cs="Times New Roman" w:eastAsia="Times New Roman" w:hAnsi="Times New Roman"/>
+          <w:sz w:val="28"/>
+          <w:szCs w:val="28"/>
+        </w:rPr>
+      </w:pPr>
+      <w:r>
+        <w:rPr>
+          <w:rtl w:val="0"/>
+        </w:rPr>
+      </w:r>
+    </w:p>
+    <w:p>
+      <w:pPr>
+        <w:jc w:val="both"/>
+        <w:rPr>
+          <w:rFonts w:ascii="Times New Roman" w:cs="Times New Roman" w:eastAsia="Times New Roman" w:hAnsi="Times New Roman"/>
+          <w:sz w:val="28"/>
+          <w:szCs w:val="28"/>
+        </w:rPr>
+      </w:pPr>
+      <w:r>
+        <w:rPr>
+          <w:rFonts w:ascii="Times New Roman" w:cs="Times New Roman" w:eastAsia="Times New Roman" w:hAnsi="Times New Roman"/>
+          <w:sz w:val="28"/>
+          <w:szCs w:val="28"/>
+          <w:rtl w:val="0"/>
+        </w:rPr>
+        <w:t xml:space="preserve">Код з теми:</w:t>
+        <w:br w:type="textWrapping"/>
+      </w:r>
+      <w:hyperlink r:id="rId27">
+        <w:r>
+          <w:rPr>
+            <w:rFonts w:ascii="Times New Roman" w:cs="Times New Roman" w:eastAsia="Times New Roman" w:hAnsi="Times New Roman"/>
+            <w:color w:val="1155cc"/>
+            <w:sz w:val="28"/>
+            <w:szCs w:val="28"/>
+            <w:u w:val="single"/>
+            <w:rtl w:val="0"/>
+          </w:rPr>
+          <w:t xml:space="preserve">https://github.com/dima648228/ProgrammingTechnologiesCS252-Vyshniak/tree/main/topic_05</w:t>
+        </w:r>
+      </w:hyperlink>
       <w:r>
         <w:rPr>
           <w:rtl w:val="0"/>
@@ -1966,7 +2387,7 @@
       </w:r>
     </w:p>
     <w:sectPr>
-      <w:headerReference r:id="rId23" w:type="default"/>
+      <w:headerReference r:id="rId28" w:type="default"/>
       <w:pgSz w:h="15840" w:w="12240" w:orient="portrait"/>
       <w:pgMar w:bottom="1440" w:top="1440" w:left="1440" w:right="1440" w:header="720" w:footer="720"/>
       <w:pgNumType w:start="1"/>

</xml_diff>

<commit_message>
Implemented topic 6 and topic 7. Updated TopicSummary
</commit_message>
<xml_diff>
--- a/TopicSummary.docx
+++ b/TopicSummary.docx
@@ -306,12 +306,12 @@
           <wp:inline distB="114300" distT="114300" distL="114300" distR="114300">
             <wp:extent cx="5876925" cy="542925"/>
             <wp:effectExtent b="0" l="0" r="0" t="0"/>
-            <wp:docPr id="6" name="image7.png"/>
+            <wp:docPr id="17" name="image3.png"/>
             <a:graphic>
               <a:graphicData uri="http://schemas.openxmlformats.org/drawingml/2006/picture">
                 <pic:pic>
                   <pic:nvPicPr>
-                    <pic:cNvPr id="0" name="image7.png"/>
+                    <pic:cNvPr id="0" name="image3.png"/>
                     <pic:cNvPicPr preferRelativeResize="0"/>
                   </pic:nvPicPr>
                   <pic:blipFill>
@@ -417,12 +417,12 @@
           <wp:inline distB="114300" distT="114300" distL="114300" distR="114300">
             <wp:extent cx="1885950" cy="1447800"/>
             <wp:effectExtent b="0" l="0" r="0" t="0"/>
-            <wp:docPr id="7" name="image4.png"/>
+            <wp:docPr id="18" name="image8.png"/>
             <a:graphic>
               <a:graphicData uri="http://schemas.openxmlformats.org/drawingml/2006/picture">
                 <pic:pic>
                   <pic:nvPicPr>
-                    <pic:cNvPr id="0" name="image4.png"/>
+                    <pic:cNvPr id="0" name="image8.png"/>
                     <pic:cNvPicPr preferRelativeResize="0"/>
                   </pic:nvPicPr>
                   <pic:blipFill>
@@ -508,12 +508,12 @@
           <wp:inline distB="114300" distT="114300" distL="114300" distR="114300">
             <wp:extent cx="5867400" cy="1343025"/>
             <wp:effectExtent b="0" l="0" r="0" t="0"/>
-            <wp:docPr id="2" name="image5.png"/>
+            <wp:docPr id="14" name="image12.png"/>
             <a:graphic>
               <a:graphicData uri="http://schemas.openxmlformats.org/drawingml/2006/picture">
                 <pic:pic>
                   <pic:nvPicPr>
-                    <pic:cNvPr id="0" name="image5.png"/>
+                    <pic:cNvPr id="0" name="image12.png"/>
                     <pic:cNvPicPr preferRelativeResize="0"/>
                   </pic:nvPicPr>
                   <pic:blipFill>
@@ -619,12 +619,12 @@
           <wp:inline distB="114300" distT="114300" distL="114300" distR="114300">
             <wp:extent cx="5857875" cy="2428875"/>
             <wp:effectExtent b="0" l="0" r="0" t="0"/>
-            <wp:docPr id="11" name="image9.png"/>
+            <wp:docPr id="7" name="image13.png"/>
             <a:graphic>
               <a:graphicData uri="http://schemas.openxmlformats.org/drawingml/2006/picture">
                 <pic:pic>
                   <pic:nvPicPr>
-                    <pic:cNvPr id="0" name="image9.png"/>
+                    <pic:cNvPr id="0" name="image13.png"/>
                     <pic:cNvPicPr preferRelativeResize="0"/>
                   </pic:nvPicPr>
                   <pic:blipFill>
@@ -870,12 +870,12 @@
           <wp:inline distB="114300" distT="114300" distL="114300" distR="114300">
             <wp:extent cx="5895975" cy="1619250"/>
             <wp:effectExtent b="0" l="0" r="0" t="0"/>
-            <wp:docPr id="9" name="image8.png"/>
+            <wp:docPr id="20" name="image7.png"/>
             <a:graphic>
               <a:graphicData uri="http://schemas.openxmlformats.org/drawingml/2006/picture">
                 <pic:pic>
                   <pic:nvPicPr>
-                    <pic:cNvPr id="0" name="image8.png"/>
+                    <pic:cNvPr id="0" name="image7.png"/>
                     <pic:cNvPicPr preferRelativeResize="0"/>
                   </pic:nvPicPr>
                   <pic:blipFill>
@@ -997,12 +997,12 @@
           <wp:inline distB="114300" distT="114300" distL="114300" distR="114300">
             <wp:extent cx="5886450" cy="2447925"/>
             <wp:effectExtent b="0" l="0" r="0" t="0"/>
-            <wp:docPr id="13" name="image15.png"/>
+            <wp:docPr id="9" name="image20.png"/>
             <a:graphic>
               <a:graphicData uri="http://schemas.openxmlformats.org/drawingml/2006/picture">
                 <pic:pic>
                   <pic:nvPicPr>
-                    <pic:cNvPr id="0" name="image15.png"/>
+                    <pic:cNvPr id="0" name="image20.png"/>
                     <pic:cNvPicPr preferRelativeResize="0"/>
                   </pic:nvPicPr>
                   <pic:blipFill>
@@ -1108,12 +1108,12 @@
           <wp:inline distB="114300" distT="114300" distL="114300" distR="114300">
             <wp:extent cx="5876925" cy="2447925"/>
             <wp:effectExtent b="0" l="0" r="0" t="0"/>
-            <wp:docPr id="5" name="image11.png"/>
+            <wp:docPr id="5" name="image23.png"/>
             <a:graphic>
               <a:graphicData uri="http://schemas.openxmlformats.org/drawingml/2006/picture">
                 <pic:pic>
                   <pic:nvPicPr>
-                    <pic:cNvPr id="0" name="image11.png"/>
+                    <pic:cNvPr id="0" name="image23.png"/>
                     <pic:cNvPicPr preferRelativeResize="0"/>
                   </pic:nvPicPr>
                   <pic:blipFill>
@@ -1370,12 +1370,12 @@
           <wp:inline distB="114300" distT="114300" distL="114300" distR="114300">
             <wp:extent cx="5943600" cy="1790700"/>
             <wp:effectExtent b="0" l="0" r="0" t="0"/>
-            <wp:docPr id="4" name="image13.png"/>
+            <wp:docPr id="4" name="image2.png"/>
             <a:graphic>
               <a:graphicData uri="http://schemas.openxmlformats.org/drawingml/2006/picture">
                 <pic:pic>
                   <pic:nvPicPr>
-                    <pic:cNvPr id="0" name="image13.png"/>
+                    <pic:cNvPr id="0" name="image2.png"/>
                     <pic:cNvPicPr preferRelativeResize="0"/>
                   </pic:nvPicPr>
                   <pic:blipFill>
@@ -1477,12 +1477,12 @@
           <wp:inline distB="114300" distT="114300" distL="114300" distR="114300">
             <wp:extent cx="5943600" cy="1625600"/>
             <wp:effectExtent b="0" l="0" r="0" t="0"/>
-            <wp:docPr id="14" name="image14.png"/>
+            <wp:docPr id="10" name="image5.png"/>
             <a:graphic>
               <a:graphicData uri="http://schemas.openxmlformats.org/drawingml/2006/picture">
                 <pic:pic>
                   <pic:nvPicPr>
-                    <pic:cNvPr id="0" name="image14.png"/>
+                    <pic:cNvPr id="0" name="image5.png"/>
                     <pic:cNvPicPr preferRelativeResize="0"/>
                   </pic:nvPicPr>
                   <pic:blipFill>
@@ -1584,12 +1584,12 @@
           <wp:inline distB="114300" distT="114300" distL="114300" distR="114300">
             <wp:extent cx="5943600" cy="1320800"/>
             <wp:effectExtent b="0" l="0" r="0" t="0"/>
-            <wp:docPr id="8" name="image12.png"/>
+            <wp:docPr id="19" name="image21.png"/>
             <a:graphic>
               <a:graphicData uri="http://schemas.openxmlformats.org/drawingml/2006/picture">
                 <pic:pic>
                   <pic:nvPicPr>
-                    <pic:cNvPr id="0" name="image12.png"/>
+                    <pic:cNvPr id="0" name="image21.png"/>
                     <pic:cNvPicPr preferRelativeResize="0"/>
                   </pic:nvPicPr>
                   <pic:blipFill>
@@ -1691,12 +1691,12 @@
           <wp:inline distB="114300" distT="114300" distL="114300" distR="114300">
             <wp:extent cx="5943600" cy="850900"/>
             <wp:effectExtent b="0" l="0" r="0" t="0"/>
-            <wp:docPr id="16" name="image16.png"/>
+            <wp:docPr id="12" name="image22.png"/>
             <a:graphic>
               <a:graphicData uri="http://schemas.openxmlformats.org/drawingml/2006/picture">
                 <pic:pic>
                   <pic:nvPicPr>
-                    <pic:cNvPr id="0" name="image16.png"/>
+                    <pic:cNvPr id="0" name="image22.png"/>
                     <pic:cNvPicPr preferRelativeResize="0"/>
                   </pic:nvPicPr>
                   <pic:blipFill>
@@ -1874,12 +1874,12 @@
           <wp:inline distB="114300" distT="114300" distL="114300" distR="114300">
             <wp:extent cx="5791200" cy="3381375"/>
             <wp:effectExtent b="0" l="0" r="0" t="0"/>
-            <wp:docPr id="12" name="image10.png"/>
+            <wp:docPr id="8" name="image9.png"/>
             <a:graphic>
               <a:graphicData uri="http://schemas.openxmlformats.org/drawingml/2006/picture">
                 <pic:pic>
                   <pic:nvPicPr>
-                    <pic:cNvPr id="0" name="image10.png"/>
+                    <pic:cNvPr id="0" name="image9.png"/>
                     <pic:cNvPicPr preferRelativeResize="0"/>
                   </pic:nvPicPr>
                   <pic:blipFill>
@@ -2041,12 +2041,12 @@
           <wp:inline distB="114300" distT="114300" distL="114300" distR="114300">
             <wp:extent cx="5943600" cy="2476500"/>
             <wp:effectExtent b="0" l="0" r="0" t="0"/>
-            <wp:docPr id="3" name="image3.png"/>
+            <wp:docPr id="15" name="image10.png"/>
             <a:graphic>
               <a:graphicData uri="http://schemas.openxmlformats.org/drawingml/2006/picture">
                 <pic:pic>
                   <pic:nvPicPr>
-                    <pic:cNvPr id="0" name="image3.png"/>
+                    <pic:cNvPr id="0" name="image10.png"/>
                     <pic:cNvPicPr preferRelativeResize="0"/>
                   </pic:nvPicPr>
                   <pic:blipFill>
@@ -2139,12 +2139,12 @@
           <wp:inline distB="114300" distT="114300" distL="114300" distR="114300">
             <wp:extent cx="5943600" cy="2501900"/>
             <wp:effectExtent b="0" l="0" r="0" t="0"/>
-            <wp:docPr id="10" name="image2.png"/>
+            <wp:docPr id="21" name="image19.png"/>
             <a:graphic>
               <a:graphicData uri="http://schemas.openxmlformats.org/drawingml/2006/picture">
                 <pic:pic>
                   <pic:nvPicPr>
-                    <pic:cNvPr id="0" name="image2.png"/>
+                    <pic:cNvPr id="0" name="image19.png"/>
                     <pic:cNvPicPr preferRelativeResize="0"/>
                   </pic:nvPicPr>
                   <pic:blipFill>
@@ -2229,12 +2229,12 @@
           <wp:inline distB="114300" distT="114300" distL="114300" distR="114300">
             <wp:extent cx="2838450" cy="1057275"/>
             <wp:effectExtent b="0" l="0" r="0" t="0"/>
-            <wp:docPr id="1" name="image1.png"/>
+            <wp:docPr id="2" name="image6.png"/>
             <a:graphic>
               <a:graphicData uri="http://schemas.openxmlformats.org/drawingml/2006/picture">
                 <pic:pic>
                   <pic:nvPicPr>
-                    <pic:cNvPr id="0" name="image1.png"/>
+                    <pic:cNvPr id="0" name="image6.png"/>
                     <pic:cNvPicPr preferRelativeResize="0"/>
                   </pic:nvPicPr>
                   <pic:blipFill>
@@ -2283,12 +2283,12 @@
           <wp:inline distB="114300" distT="114300" distL="114300" distR="114300">
             <wp:extent cx="5943600" cy="1600200"/>
             <wp:effectExtent b="0" l="0" r="0" t="0"/>
-            <wp:docPr id="15" name="image6.png"/>
+            <wp:docPr id="22" name="image15.png"/>
             <a:graphic>
               <a:graphicData uri="http://schemas.openxmlformats.org/drawingml/2006/picture">
                 <pic:pic>
                   <pic:nvPicPr>
-                    <pic:cNvPr id="0" name="image6.png"/>
+                    <pic:cNvPr id="0" name="image15.png"/>
                     <pic:cNvPicPr preferRelativeResize="0"/>
                   </pic:nvPicPr>
                   <pic:blipFill>
@@ -2386,8 +2386,684 @@
         </w:rPr>
       </w:r>
     </w:p>
+    <w:p>
+      <w:pPr>
+        <w:jc w:val="both"/>
+        <w:rPr>
+          <w:rFonts w:ascii="Times New Roman" w:cs="Times New Roman" w:eastAsia="Times New Roman" w:hAnsi="Times New Roman"/>
+          <w:sz w:val="28"/>
+          <w:szCs w:val="28"/>
+        </w:rPr>
+      </w:pPr>
+      <w:r>
+        <w:rPr>
+          <w:rtl w:val="0"/>
+        </w:rPr>
+      </w:r>
+    </w:p>
+    <w:p>
+      <w:pPr>
+        <w:jc w:val="center"/>
+        <w:rPr>
+          <w:rFonts w:ascii="Times New Roman" w:cs="Times New Roman" w:eastAsia="Times New Roman" w:hAnsi="Times New Roman"/>
+          <w:sz w:val="28"/>
+          <w:szCs w:val="28"/>
+        </w:rPr>
+      </w:pPr>
+      <w:r>
+        <w:rPr>
+          <w:rFonts w:ascii="Times New Roman" w:cs="Times New Roman" w:eastAsia="Times New Roman" w:hAnsi="Times New Roman"/>
+          <w:sz w:val="28"/>
+          <w:szCs w:val="28"/>
+          <w:rtl w:val="0"/>
+        </w:rPr>
+        <w:t xml:space="preserve">Тема №6: </w:t>
+      </w:r>
+      <w:hyperlink r:id="rId28">
+        <w:r>
+          <w:rPr>
+            <w:rFonts w:ascii="Times New Roman" w:cs="Times New Roman" w:eastAsia="Times New Roman" w:hAnsi="Times New Roman"/>
+            <w:sz w:val="28"/>
+            <w:szCs w:val="28"/>
+            <w:rtl w:val="0"/>
+          </w:rPr>
+          <w:t xml:space="preserve">Робота з файлами</w:t>
+        </w:r>
+      </w:hyperlink>
+      <w:r>
+        <w:rPr>
+          <w:rFonts w:ascii="Times New Roman" w:cs="Times New Roman" w:eastAsia="Times New Roman" w:hAnsi="Times New Roman"/>
+          <w:sz w:val="28"/>
+          <w:szCs w:val="28"/>
+          <w:rtl w:val="0"/>
+        </w:rPr>
+        <w:t xml:space="preserve"> </w:t>
+      </w:r>
+    </w:p>
+    <w:p>
+      <w:pPr>
+        <w:jc w:val="both"/>
+        <w:rPr>
+          <w:rFonts w:ascii="Times New Roman" w:cs="Times New Roman" w:eastAsia="Times New Roman" w:hAnsi="Times New Roman"/>
+          <w:sz w:val="28"/>
+          <w:szCs w:val="28"/>
+        </w:rPr>
+      </w:pPr>
+      <w:r>
+        <w:rPr>
+          <w:rFonts w:ascii="Times New Roman" w:cs="Times New Roman" w:eastAsia="Times New Roman" w:hAnsi="Times New Roman"/>
+          <w:sz w:val="28"/>
+          <w:szCs w:val="28"/>
+          <w:rtl w:val="0"/>
+        </w:rPr>
+        <w:t xml:space="preserve">Завдання 1:</w:t>
+        <w:br w:type="textWrapping"/>
+        <w:t xml:space="preserve">Програму калькулятор було доповнено логуванням, яке зберігається у окремий файл. Результат:</w:t>
+        <w:br w:type="textWrapping"/>
+      </w:r>
+      <w:r>
+        <w:rPr>
+          <w:rFonts w:ascii="Times New Roman" w:cs="Times New Roman" w:eastAsia="Times New Roman" w:hAnsi="Times New Roman"/>
+          <w:sz w:val="28"/>
+          <w:szCs w:val="28"/>
+        </w:rPr>
+        <w:drawing>
+          <wp:inline distB="114300" distT="114300" distL="114300" distR="114300">
+            <wp:extent cx="5943600" cy="2501900"/>
+            <wp:effectExtent b="0" l="0" r="0" t="0"/>
+            <wp:docPr id="11" name="image14.png"/>
+            <a:graphic>
+              <a:graphicData uri="http://schemas.openxmlformats.org/drawingml/2006/picture">
+                <pic:pic>
+                  <pic:nvPicPr>
+                    <pic:cNvPr id="0" name="image14.png"/>
+                    <pic:cNvPicPr preferRelativeResize="0"/>
+                  </pic:nvPicPr>
+                  <pic:blipFill>
+                    <a:blip r:embed="rId29"/>
+                    <a:srcRect b="0" l="0" r="0" t="0"/>
+                    <a:stretch>
+                      <a:fillRect/>
+                    </a:stretch>
+                  </pic:blipFill>
+                  <pic:spPr>
+                    <a:xfrm>
+                      <a:off x="0" y="0"/>
+                      <a:ext cx="5943600" cy="2501900"/>
+                    </a:xfrm>
+                    <a:prstGeom prst="rect"/>
+                    <a:ln/>
+                  </pic:spPr>
+                </pic:pic>
+              </a:graphicData>
+            </a:graphic>
+          </wp:inline>
+        </w:drawing>
+      </w:r>
+      <w:r>
+        <w:rPr>
+          <w:rFonts w:ascii="Times New Roman" w:cs="Times New Roman" w:eastAsia="Times New Roman" w:hAnsi="Times New Roman"/>
+          <w:sz w:val="28"/>
+          <w:szCs w:val="28"/>
+        </w:rPr>
+        <w:drawing>
+          <wp:inline distB="114300" distT="114300" distL="114300" distR="114300">
+            <wp:extent cx="2990850" cy="2628900"/>
+            <wp:effectExtent b="0" l="0" r="0" t="0"/>
+            <wp:docPr id="23" name="image18.png"/>
+            <a:graphic>
+              <a:graphicData uri="http://schemas.openxmlformats.org/drawingml/2006/picture">
+                <pic:pic>
+                  <pic:nvPicPr>
+                    <pic:cNvPr id="0" name="image18.png"/>
+                    <pic:cNvPicPr preferRelativeResize="0"/>
+                  </pic:nvPicPr>
+                  <pic:blipFill>
+                    <a:blip r:embed="rId30"/>
+                    <a:srcRect b="0" l="0" r="0" t="0"/>
+                    <a:stretch>
+                      <a:fillRect/>
+                    </a:stretch>
+                  </pic:blipFill>
+                  <pic:spPr>
+                    <a:xfrm>
+                      <a:off x="0" y="0"/>
+                      <a:ext cx="2990850" cy="2628900"/>
+                    </a:xfrm>
+                    <a:prstGeom prst="rect"/>
+                    <a:ln/>
+                  </pic:spPr>
+                </pic:pic>
+              </a:graphicData>
+            </a:graphic>
+          </wp:inline>
+        </w:drawing>
+      </w:r>
+      <w:r>
+        <w:rPr>
+          <w:rFonts w:ascii="Times New Roman" w:cs="Times New Roman" w:eastAsia="Times New Roman" w:hAnsi="Times New Roman"/>
+          <w:sz w:val="28"/>
+          <w:szCs w:val="28"/>
+          <w:rtl w:val="0"/>
+        </w:rPr>
+        <w:br w:type="textWrapping"/>
+      </w:r>
+      <w:r>
+        <w:rPr>
+          <w:rFonts w:ascii="Times New Roman" w:cs="Times New Roman" w:eastAsia="Times New Roman" w:hAnsi="Times New Roman"/>
+          <w:sz w:val="28"/>
+          <w:szCs w:val="28"/>
+        </w:rPr>
+        <w:drawing>
+          <wp:inline distB="114300" distT="114300" distL="114300" distR="114300">
+            <wp:extent cx="4876800" cy="2514600"/>
+            <wp:effectExtent b="0" l="0" r="0" t="0"/>
+            <wp:docPr id="16" name="image11.png"/>
+            <a:graphic>
+              <a:graphicData uri="http://schemas.openxmlformats.org/drawingml/2006/picture">
+                <pic:pic>
+                  <pic:nvPicPr>
+                    <pic:cNvPr id="0" name="image11.png"/>
+                    <pic:cNvPicPr preferRelativeResize="0"/>
+                  </pic:nvPicPr>
+                  <pic:blipFill>
+                    <a:blip r:embed="rId31"/>
+                    <a:srcRect b="0" l="0" r="0" t="0"/>
+                    <a:stretch>
+                      <a:fillRect/>
+                    </a:stretch>
+                  </pic:blipFill>
+                  <pic:spPr>
+                    <a:xfrm>
+                      <a:off x="0" y="0"/>
+                      <a:ext cx="4876800" cy="2514600"/>
+                    </a:xfrm>
+                    <a:prstGeom prst="rect"/>
+                    <a:ln/>
+                  </pic:spPr>
+                </pic:pic>
+              </a:graphicData>
+            </a:graphic>
+          </wp:inline>
+        </w:drawing>
+      </w:r>
+      <w:r>
+        <w:rPr>
+          <w:rtl w:val="0"/>
+        </w:rPr>
+      </w:r>
+    </w:p>
+    <w:p>
+      <w:pPr>
+        <w:jc w:val="both"/>
+        <w:rPr>
+          <w:rFonts w:ascii="Times New Roman" w:cs="Times New Roman" w:eastAsia="Times New Roman" w:hAnsi="Times New Roman"/>
+          <w:sz w:val="28"/>
+          <w:szCs w:val="28"/>
+        </w:rPr>
+      </w:pPr>
+      <w:r>
+        <w:rPr>
+          <w:rtl w:val="0"/>
+        </w:rPr>
+      </w:r>
+    </w:p>
+    <w:p>
+      <w:pPr>
+        <w:jc w:val="both"/>
+        <w:rPr>
+          <w:rFonts w:ascii="Times New Roman" w:cs="Times New Roman" w:eastAsia="Times New Roman" w:hAnsi="Times New Roman"/>
+          <w:sz w:val="28"/>
+          <w:szCs w:val="28"/>
+        </w:rPr>
+      </w:pPr>
+      <w:r>
+        <w:rPr>
+          <w:rFonts w:ascii="Times New Roman" w:cs="Times New Roman" w:eastAsia="Times New Roman" w:hAnsi="Times New Roman"/>
+          <w:sz w:val="28"/>
+          <w:szCs w:val="28"/>
+          <w:rtl w:val="0"/>
+        </w:rPr>
+        <w:t xml:space="preserve">Завдання 2:</w:t>
+        <w:br w:type="textWrapping"/>
+        <w:t xml:space="preserve">Було виконано сортування не відсортованого списку  за допомогою функції sorted та лямбда функцій (за алфавітом та за оцінками у зростаючому порядку). Результат:</w:t>
+        <w:br w:type="textWrapping"/>
+      </w:r>
+      <w:r>
+        <w:rPr>
+          <w:rFonts w:ascii="Times New Roman" w:cs="Times New Roman" w:eastAsia="Times New Roman" w:hAnsi="Times New Roman"/>
+          <w:sz w:val="28"/>
+          <w:szCs w:val="28"/>
+        </w:rPr>
+        <w:drawing>
+          <wp:inline distB="114300" distT="114300" distL="114300" distR="114300">
+            <wp:extent cx="5943600" cy="3454400"/>
+            <wp:effectExtent b="0" l="0" r="0" t="0"/>
+            <wp:docPr id="3" name="image1.png"/>
+            <a:graphic>
+              <a:graphicData uri="http://schemas.openxmlformats.org/drawingml/2006/picture">
+                <pic:pic>
+                  <pic:nvPicPr>
+                    <pic:cNvPr id="0" name="image1.png"/>
+                    <pic:cNvPicPr preferRelativeResize="0"/>
+                  </pic:nvPicPr>
+                  <pic:blipFill>
+                    <a:blip r:embed="rId32"/>
+                    <a:srcRect b="0" l="0" r="0" t="0"/>
+                    <a:stretch>
+                      <a:fillRect/>
+                    </a:stretch>
+                  </pic:blipFill>
+                  <pic:spPr>
+                    <a:xfrm>
+                      <a:off x="0" y="0"/>
+                      <a:ext cx="5943600" cy="3454400"/>
+                    </a:xfrm>
+                    <a:prstGeom prst="rect"/>
+                    <a:ln/>
+                  </pic:spPr>
+                </pic:pic>
+              </a:graphicData>
+            </a:graphic>
+          </wp:inline>
+        </w:drawing>
+      </w:r>
+      <w:r>
+        <w:rPr>
+          <w:rtl w:val="0"/>
+        </w:rPr>
+      </w:r>
+    </w:p>
+    <w:p>
+      <w:pPr>
+        <w:jc w:val="both"/>
+        <w:rPr>
+          <w:rFonts w:ascii="Times New Roman" w:cs="Times New Roman" w:eastAsia="Times New Roman" w:hAnsi="Times New Roman"/>
+          <w:sz w:val="28"/>
+          <w:szCs w:val="28"/>
+        </w:rPr>
+      </w:pPr>
+      <w:r>
+        <w:rPr>
+          <w:rtl w:val="0"/>
+        </w:rPr>
+      </w:r>
+    </w:p>
+    <w:p>
+      <w:pPr>
+        <w:jc w:val="both"/>
+        <w:rPr>
+          <w:rFonts w:ascii="Times New Roman" w:cs="Times New Roman" w:eastAsia="Times New Roman" w:hAnsi="Times New Roman"/>
+          <w:sz w:val="28"/>
+          <w:szCs w:val="28"/>
+        </w:rPr>
+      </w:pPr>
+      <w:r>
+        <w:rPr>
+          <w:rFonts w:ascii="Times New Roman" w:cs="Times New Roman" w:eastAsia="Times New Roman" w:hAnsi="Times New Roman"/>
+          <w:sz w:val="28"/>
+          <w:szCs w:val="28"/>
+          <w:rtl w:val="0"/>
+        </w:rPr>
+        <w:t xml:space="preserve">Код з теми:</w:t>
+        <w:br w:type="textWrapping"/>
+      </w:r>
+      <w:hyperlink r:id="rId33">
+        <w:r>
+          <w:rPr>
+            <w:rFonts w:ascii="Times New Roman" w:cs="Times New Roman" w:eastAsia="Times New Roman" w:hAnsi="Times New Roman"/>
+            <w:color w:val="1155cc"/>
+            <w:sz w:val="28"/>
+            <w:szCs w:val="28"/>
+            <w:u w:val="single"/>
+            <w:rtl w:val="0"/>
+          </w:rPr>
+          <w:t xml:space="preserve">https://github.com/dima648228/ProgrammingTechnologiesCS252-Vyshniak/tree/main/topic_06</w:t>
+        </w:r>
+      </w:hyperlink>
+      <w:r>
+        <w:rPr>
+          <w:rtl w:val="0"/>
+        </w:rPr>
+      </w:r>
+    </w:p>
+    <w:p>
+      <w:pPr>
+        <w:jc w:val="both"/>
+        <w:rPr>
+          <w:rFonts w:ascii="Times New Roman" w:cs="Times New Roman" w:eastAsia="Times New Roman" w:hAnsi="Times New Roman"/>
+          <w:sz w:val="28"/>
+          <w:szCs w:val="28"/>
+        </w:rPr>
+      </w:pPr>
+      <w:r>
+        <w:rPr>
+          <w:rtl w:val="0"/>
+        </w:rPr>
+      </w:r>
+    </w:p>
+    <w:p>
+      <w:pPr>
+        <w:jc w:val="center"/>
+        <w:rPr>
+          <w:rFonts w:ascii="Times New Roman" w:cs="Times New Roman" w:eastAsia="Times New Roman" w:hAnsi="Times New Roman"/>
+          <w:sz w:val="28"/>
+          <w:szCs w:val="28"/>
+        </w:rPr>
+      </w:pPr>
+      <w:r>
+        <w:rPr>
+          <w:rFonts w:ascii="Times New Roman" w:cs="Times New Roman" w:eastAsia="Times New Roman" w:hAnsi="Times New Roman"/>
+          <w:sz w:val="28"/>
+          <w:szCs w:val="28"/>
+          <w:rtl w:val="0"/>
+        </w:rPr>
+        <w:t xml:space="preserve">Тема №7: </w:t>
+      </w:r>
+      <w:hyperlink r:id="rId34">
+        <w:r>
+          <w:rPr>
+            <w:rFonts w:ascii="Times New Roman" w:cs="Times New Roman" w:eastAsia="Times New Roman" w:hAnsi="Times New Roman"/>
+            <w:sz w:val="28"/>
+            <w:szCs w:val="28"/>
+            <w:rtl w:val="0"/>
+          </w:rPr>
+          <w:t xml:space="preserve">Об'єктно-орієнтоване програмування</w:t>
+        </w:r>
+      </w:hyperlink>
+      <w:r>
+        <w:rPr>
+          <w:rFonts w:ascii="Times New Roman" w:cs="Times New Roman" w:eastAsia="Times New Roman" w:hAnsi="Times New Roman"/>
+          <w:sz w:val="28"/>
+          <w:szCs w:val="28"/>
+          <w:rtl w:val="0"/>
+        </w:rPr>
+        <w:t xml:space="preserve"> </w:t>
+      </w:r>
+    </w:p>
+    <w:p>
+      <w:pPr>
+        <w:jc w:val="both"/>
+        <w:rPr>
+          <w:rFonts w:ascii="Times New Roman" w:cs="Times New Roman" w:eastAsia="Times New Roman" w:hAnsi="Times New Roman"/>
+          <w:sz w:val="28"/>
+          <w:szCs w:val="28"/>
+        </w:rPr>
+      </w:pPr>
+      <w:r>
+        <w:rPr>
+          <w:rFonts w:ascii="Times New Roman" w:cs="Times New Roman" w:eastAsia="Times New Roman" w:hAnsi="Times New Roman"/>
+          <w:sz w:val="28"/>
+          <w:szCs w:val="28"/>
+          <w:rtl w:val="0"/>
+        </w:rPr>
+        <w:t xml:space="preserve">Завдання 1:</w:t>
+        <w:br w:type="textWrapping"/>
+        <w:t xml:space="preserve">Було написано клас для прикладу, щоб показати роботу магічних функцій str, len, repr та del. Результат:</w:t>
+        <w:br w:type="textWrapping"/>
+      </w:r>
+      <w:r>
+        <w:rPr>
+          <w:rFonts w:ascii="Times New Roman" w:cs="Times New Roman" w:eastAsia="Times New Roman" w:hAnsi="Times New Roman"/>
+          <w:sz w:val="28"/>
+          <w:szCs w:val="28"/>
+        </w:rPr>
+        <w:drawing>
+          <wp:inline distB="114300" distT="114300" distL="114300" distR="114300">
+            <wp:extent cx="5829300" cy="781050"/>
+            <wp:effectExtent b="0" l="0" r="0" t="0"/>
+            <wp:docPr id="6" name="image16.png"/>
+            <a:graphic>
+              <a:graphicData uri="http://schemas.openxmlformats.org/drawingml/2006/picture">
+                <pic:pic>
+                  <pic:nvPicPr>
+                    <pic:cNvPr id="0" name="image16.png"/>
+                    <pic:cNvPicPr preferRelativeResize="0"/>
+                  </pic:nvPicPr>
+                  <pic:blipFill>
+                    <a:blip r:embed="rId35"/>
+                    <a:srcRect b="0" l="0" r="0" t="0"/>
+                    <a:stretch>
+                      <a:fillRect/>
+                    </a:stretch>
+                  </pic:blipFill>
+                  <pic:spPr>
+                    <a:xfrm>
+                      <a:off x="0" y="0"/>
+                      <a:ext cx="5829300" cy="781050"/>
+                    </a:xfrm>
+                    <a:prstGeom prst="rect"/>
+                    <a:ln/>
+                  </pic:spPr>
+                </pic:pic>
+              </a:graphicData>
+            </a:graphic>
+          </wp:inline>
+        </w:drawing>
+      </w:r>
+      <w:r>
+        <w:rPr>
+          <w:rtl w:val="0"/>
+        </w:rPr>
+      </w:r>
+    </w:p>
+    <w:p>
+      <w:pPr>
+        <w:jc w:val="both"/>
+        <w:rPr>
+          <w:rFonts w:ascii="Times New Roman" w:cs="Times New Roman" w:eastAsia="Times New Roman" w:hAnsi="Times New Roman"/>
+          <w:sz w:val="28"/>
+          <w:szCs w:val="28"/>
+        </w:rPr>
+      </w:pPr>
+      <w:r>
+        <w:rPr>
+          <w:rtl w:val="0"/>
+        </w:rPr>
+      </w:r>
+    </w:p>
+    <w:p>
+      <w:pPr>
+        <w:jc w:val="both"/>
+        <w:rPr>
+          <w:rFonts w:ascii="Times New Roman" w:cs="Times New Roman" w:eastAsia="Times New Roman" w:hAnsi="Times New Roman"/>
+          <w:sz w:val="28"/>
+          <w:szCs w:val="28"/>
+        </w:rPr>
+      </w:pPr>
+      <w:r>
+        <w:rPr>
+          <w:rFonts w:ascii="Times New Roman" w:cs="Times New Roman" w:eastAsia="Times New Roman" w:hAnsi="Times New Roman"/>
+          <w:sz w:val="28"/>
+          <w:szCs w:val="28"/>
+          <w:rtl w:val="0"/>
+        </w:rPr>
+        <w:t xml:space="preserve">Завдання 2:</w:t>
+        <w:br w:type="textWrapping"/>
+        <w:t xml:space="preserve">Було створено клас студента та список в якому зберыгаються об’єкти цього класу. Елементи було відсортовано за алфавітом та окремо за віком студента. Результат:</w:t>
+        <w:br w:type="textWrapping"/>
+      </w:r>
+      <w:r>
+        <w:rPr>
+          <w:rFonts w:ascii="Times New Roman" w:cs="Times New Roman" w:eastAsia="Times New Roman" w:hAnsi="Times New Roman"/>
+          <w:sz w:val="28"/>
+          <w:szCs w:val="28"/>
+        </w:rPr>
+        <w:drawing>
+          <wp:inline distB="114300" distT="114300" distL="114300" distR="114300">
+            <wp:extent cx="5943600" cy="1689100"/>
+            <wp:effectExtent b="0" l="0" r="0" t="0"/>
+            <wp:docPr id="1" name="image17.png"/>
+            <a:graphic>
+              <a:graphicData uri="http://schemas.openxmlformats.org/drawingml/2006/picture">
+                <pic:pic>
+                  <pic:nvPicPr>
+                    <pic:cNvPr id="0" name="image17.png"/>
+                    <pic:cNvPicPr preferRelativeResize="0"/>
+                  </pic:nvPicPr>
+                  <pic:blipFill>
+                    <a:blip r:embed="rId36"/>
+                    <a:srcRect b="0" l="0" r="0" t="0"/>
+                    <a:stretch>
+                      <a:fillRect/>
+                    </a:stretch>
+                  </pic:blipFill>
+                  <pic:spPr>
+                    <a:xfrm>
+                      <a:off x="0" y="0"/>
+                      <a:ext cx="5943600" cy="1689100"/>
+                    </a:xfrm>
+                    <a:prstGeom prst="rect"/>
+                    <a:ln/>
+                  </pic:spPr>
+                </pic:pic>
+              </a:graphicData>
+            </a:graphic>
+          </wp:inline>
+        </w:drawing>
+      </w:r>
+      <w:r>
+        <w:rPr>
+          <w:rtl w:val="0"/>
+        </w:rPr>
+      </w:r>
+    </w:p>
+    <w:p>
+      <w:pPr>
+        <w:jc w:val="both"/>
+        <w:rPr>
+          <w:rFonts w:ascii="Times New Roman" w:cs="Times New Roman" w:eastAsia="Times New Roman" w:hAnsi="Times New Roman"/>
+          <w:sz w:val="28"/>
+          <w:szCs w:val="28"/>
+        </w:rPr>
+      </w:pPr>
+      <w:r>
+        <w:rPr>
+          <w:rtl w:val="0"/>
+        </w:rPr>
+      </w:r>
+    </w:p>
+    <w:p>
+      <w:pPr>
+        <w:jc w:val="both"/>
+        <w:rPr>
+          <w:rFonts w:ascii="Times New Roman" w:cs="Times New Roman" w:eastAsia="Times New Roman" w:hAnsi="Times New Roman"/>
+          <w:sz w:val="28"/>
+          <w:szCs w:val="28"/>
+        </w:rPr>
+      </w:pPr>
+      <w:r>
+        <w:rPr>
+          <w:rFonts w:ascii="Times New Roman" w:cs="Times New Roman" w:eastAsia="Times New Roman" w:hAnsi="Times New Roman"/>
+          <w:sz w:val="28"/>
+          <w:szCs w:val="28"/>
+          <w:rtl w:val="0"/>
+        </w:rPr>
+        <w:t xml:space="preserve">Завдання 3:</w:t>
+        <w:br w:type="textWrapping"/>
+        <w:t xml:space="preserve">Калькулятор з минулої теми було переписано використовуючи принципи ООП. Для статичних класів було використано декоратор staticmethod. Результат:</w:t>
+        <w:br w:type="textWrapping"/>
+      </w:r>
+      <w:r>
+        <w:rPr>
+          <w:rFonts w:ascii="Times New Roman" w:cs="Times New Roman" w:eastAsia="Times New Roman" w:hAnsi="Times New Roman"/>
+          <w:sz w:val="28"/>
+          <w:szCs w:val="28"/>
+        </w:rPr>
+        <w:drawing>
+          <wp:inline distB="114300" distT="114300" distL="114300" distR="114300">
+            <wp:extent cx="5943600" cy="2235200"/>
+            <wp:effectExtent b="0" l="0" r="0" t="0"/>
+            <wp:docPr id="13" name="image4.png"/>
+            <a:graphic>
+              <a:graphicData uri="http://schemas.openxmlformats.org/drawingml/2006/picture">
+                <pic:pic>
+                  <pic:nvPicPr>
+                    <pic:cNvPr id="0" name="image4.png"/>
+                    <pic:cNvPicPr preferRelativeResize="0"/>
+                  </pic:nvPicPr>
+                  <pic:blipFill>
+                    <a:blip r:embed="rId37"/>
+                    <a:srcRect b="0" l="0" r="0" t="0"/>
+                    <a:stretch>
+                      <a:fillRect/>
+                    </a:stretch>
+                  </pic:blipFill>
+                  <pic:spPr>
+                    <a:xfrm>
+                      <a:off x="0" y="0"/>
+                      <a:ext cx="5943600" cy="2235200"/>
+                    </a:xfrm>
+                    <a:prstGeom prst="rect"/>
+                    <a:ln/>
+                  </pic:spPr>
+                </pic:pic>
+              </a:graphicData>
+            </a:graphic>
+          </wp:inline>
+        </w:drawing>
+      </w:r>
+      <w:r>
+        <w:rPr>
+          <w:rtl w:val="0"/>
+        </w:rPr>
+      </w:r>
+    </w:p>
+    <w:p>
+      <w:pPr>
+        <w:jc w:val="both"/>
+        <w:rPr>
+          <w:rFonts w:ascii="Times New Roman" w:cs="Times New Roman" w:eastAsia="Times New Roman" w:hAnsi="Times New Roman"/>
+          <w:sz w:val="28"/>
+          <w:szCs w:val="28"/>
+        </w:rPr>
+      </w:pPr>
+      <w:r>
+        <w:rPr>
+          <w:rtl w:val="0"/>
+        </w:rPr>
+      </w:r>
+    </w:p>
+    <w:p>
+      <w:pPr>
+        <w:jc w:val="both"/>
+        <w:rPr>
+          <w:rFonts w:ascii="Times New Roman" w:cs="Times New Roman" w:eastAsia="Times New Roman" w:hAnsi="Times New Roman"/>
+          <w:sz w:val="28"/>
+          <w:szCs w:val="28"/>
+        </w:rPr>
+      </w:pPr>
+      <w:r>
+        <w:rPr>
+          <w:rFonts w:ascii="Times New Roman" w:cs="Times New Roman" w:eastAsia="Times New Roman" w:hAnsi="Times New Roman"/>
+          <w:sz w:val="28"/>
+          <w:szCs w:val="28"/>
+          <w:rtl w:val="0"/>
+        </w:rPr>
+        <w:t xml:space="preserve">Код з теми:</w:t>
+        <w:br w:type="textWrapping"/>
+      </w:r>
+      <w:hyperlink r:id="rId38">
+        <w:r>
+          <w:rPr>
+            <w:rFonts w:ascii="Times New Roman" w:cs="Times New Roman" w:eastAsia="Times New Roman" w:hAnsi="Times New Roman"/>
+            <w:color w:val="1155cc"/>
+            <w:sz w:val="28"/>
+            <w:szCs w:val="28"/>
+            <w:u w:val="single"/>
+            <w:rtl w:val="0"/>
+          </w:rPr>
+          <w:t xml:space="preserve">https://github.com/dima648228/ProgrammingTechnologiesCS252-Vyshniak/tree/main/topic_07</w:t>
+        </w:r>
+      </w:hyperlink>
+      <w:r>
+        <w:rPr>
+          <w:rtl w:val="0"/>
+        </w:rPr>
+      </w:r>
+    </w:p>
     <w:sectPr>
-      <w:headerReference r:id="rId28" w:type="default"/>
+      <w:headerReference r:id="rId39" w:type="default"/>
       <w:pgSz w:h="15840" w:w="12240" w:orient="portrait"/>
       <w:pgMar w:bottom="1440" w:top="1440" w:left="1440" w:right="1440" w:header="720" w:footer="720"/>
       <w:pgNumType w:start="1"/>

</xml_diff>